<commit_message>
Remove all em dashes from the manuscript (body + figures); recompile PDF + DOCX
- main.tex: 80 em dashes (---) replaced with commas; en-dash numeric ranges (e.g., 14--105)
  preserved. Comment dividers normalized.
- make_figures.py: Fig 2 gate-panel labels "Gate A — definition" etc. -> colons
  ("Gate A: definition"); these were the last 3 em dashes (baked into the figure).
- Figures regenerated, PDF (19pp) and DOCX rebuilt; verified 0 em dashes (U+2014) in the
  rendered PDF text.
</commit_message>
<xml_diff>
--- a/docs/manuscript/main.docx
+++ b/docs/manuscript/main.docx
@@ -400,13 +400,13 @@
         <w:t xml:space="preserve"> </w:t>
       </w:r>
       <w:r>
-        <w:t xml:space="preserve">occupy near-disjoint expression manifolds, this shift—biological in-vitro state and technical platform</w:t>
-      </w:r>
-      <w:r>
-        <w:t xml:space="preserve"> </w:t>
-      </w:r>
-      <w:r>
-        <w:t xml:space="preserve">differences combined—is pervasive and encoder-visible, not a separable nuisance subspace; we therefore</w:t>
+        <w:t xml:space="preserve">occupy near-disjoint expression manifolds, this shift, biological in-vitro state and technical platform</w:t>
+      </w:r>
+      <w:r>
+        <w:t xml:space="preserve"> </w:t>
+      </w:r>
+      <w:r>
+        <w:t xml:space="preserve">differences combined, is pervasive and encoder-visible, not a separable nuisance subspace; we therefore</w:t>
       </w:r>
       <w:r>
         <w:t xml:space="preserve"> </w:t>
@@ -440,13 +440,13 @@
         <w:t xml:space="preserve"> </w:t>
       </w:r>
       <w:r>
-        <w:t xml:space="preserve">contaminant populations—where, unlike the</w:t>
-      </w:r>
-      <w:r>
-        <w:t xml:space="preserve"> </w:t>
-      </w:r>
-      <w:r>
-        <w:t xml:space="preserve">reference-limited neural compartment, we are statistically powered—we show the geometry method works as</w:t>
+        <w:t xml:space="preserve">contaminant populations, where, unlike the</w:t>
+      </w:r>
+      <w:r>
+        <w:t xml:space="preserve"> </w:t>
+      </w:r>
+      <w:r>
+        <w:t xml:space="preserve">reference-limited neural compartment, we are statistically powered, we show the geometry method works as</w:t>
       </w:r>
       <w:r>
         <w:t xml:space="preserve"> </w:t>
@@ -544,7 +544,7 @@
         <w:t xml:space="preserve"> </w:t>
       </w:r>
       <w:r>
-        <w:t xml:space="preserve">distances are confounded rather than clean lineage metrics—a validated ordering, not yet a clean</w:t>
+        <w:t xml:space="preserve">distances are confounded rather than clean lineage metrics, a validated ordering, not yet a clean</w:t>
       </w:r>
       <w:r>
         <w:t xml:space="preserve"> </w:t>
@@ -566,13 +566,13 @@
         <w:t xml:space="preserve"> </w:t>
       </w:r>
       <w:r>
-        <w:t xml:space="preserve">off-target measurement—to be</w:t>
-      </w:r>
-      <w:r>
-        <w:t xml:space="preserve"> </w:t>
-      </w:r>
-      <w:r>
-        <w:t xml:space="preserve">read against the reference’s own domain, not as an absolute fidelity score—and an identifiability</w:t>
+        <w:t xml:space="preserve">off-target measurement, to be</w:t>
+      </w:r>
+      <w:r>
+        <w:t xml:space="preserve"> </w:t>
+      </w:r>
+      <w:r>
+        <w:t xml:space="preserve">read against the reference’s own domain, not as an absolute fidelity score, and an identifiability</w:t>
       </w:r>
       <w:r>
         <w:t xml:space="preserve"> </w:t>
@@ -709,7 +709,7 @@
         <w:t xml:space="preserve"> </w:t>
       </w:r>
       <w:r>
-        <w:t xml:space="preserve">(HNOCA)—an integrated transcriptomic atlas of</w:t>
+        <w:t xml:space="preserve">(HNOCA), an integrated transcriptomic atlas of</w:t>
       </w:r>
       <w:r>
         <w:t xml:space="preserve"> </w:t>
@@ -738,7 +738,7 @@
         <w:t xml:space="preserve">9</w:t>
       </w:r>
       <w:r>
-        <w:t xml:space="preserve">—makes it possible, for the first time, to study this off-target</w:t>
+        <w:t xml:space="preserve">, makes it possible, for the first time, to study this off-target</w:t>
       </w:r>
       <w:r>
         <w:t xml:space="preserve"> </w:t>
@@ -814,7 +814,7 @@
         <w:t xml:space="preserve"> </w:t>
       </w:r>
       <w:r>
-        <w:t xml:space="preserve">recently completed human references make such anchoring feasible—a comprehensive first-trimester</w:t>
+        <w:t xml:space="preserve">recently completed human references make such anchoring feasible, a comprehensive first-trimester</w:t>
       </w:r>
       <w:r>
         <w:t xml:space="preserve"> </w:t>
@@ -841,7 +841,7 @@
         <w:t xml:space="preserve">11</w:t>
       </w:r>
       <w:r>
-        <w:t xml:space="preserve">—together spanning neural and non-neural developmental origins.</w:t>
+        <w:t xml:space="preserve">, together spanning neural and non-neural developmental origins.</w:t>
       </w:r>
     </w:p>
     <w:p>
@@ -924,13 +924,13 @@
         <w:t xml:space="preserve"> </w:t>
       </w:r>
       <w:r>
-        <w:t xml:space="preserve">and assign every organoid cell two calibrated mapping scores—an off-manifold reconstruction distance</w:t>
-      </w:r>
-      <w:r>
-        <w:t xml:space="preserve"> </w:t>
-      </w:r>
-      <w:r>
-        <w:t xml:space="preserve">and a label-assignment entropy—that jointly define a six-state off-target taxonomy. We organize the</w:t>
+        <w:t xml:space="preserve">and assign every organoid cell two calibrated mapping scores, an off-manifold reconstruction distance</w:t>
+      </w:r>
+      <w:r>
+        <w:t xml:space="preserve"> </w:t>
+      </w:r>
+      <w:r>
+        <w:t xml:space="preserve">and a label-assignment entropy, that jointly define a six-state off-target taxonomy. We organize the</w:t>
       </w:r>
       <w:r>
         <w:t xml:space="preserve"> </w:t>
@@ -1556,7 +1556,7 @@
         <w:t xml:space="preserve"> </w:t>
       </w:r>
       <w:r>
-        <w:t xml:space="preserve">thresholds on held-out reference cells—a label-entropy threshold</w:t>
+        <w:t xml:space="preserve">thresholds on held-out reference cells, a label-entropy threshold</w:t>
       </w:r>
       <w:r>
         <w:t xml:space="preserve"> </w:t>
@@ -1623,7 +1623,7 @@
         </m:r>
       </m:oMath>
       <w:r>
-        <w:t xml:space="preserve">—and used them to assign each organoid cell to one of six states</w:t>
+        <w:t xml:space="preserve">, and used them to assign each organoid cell to one of six states</w:t>
       </w:r>
       <w:r>
         <w:t xml:space="preserve"> </w:t>
@@ -2484,7 +2484,7 @@
         <w:t xml:space="preserve"> </w:t>
       </w:r>
       <w:r>
-        <w:t xml:space="preserve">regionally divergent or barrier-forming protocols dominate the high end—choroid-plexus organoids</w:t>
+        <w:t xml:space="preserve">regionally divergent or barrier-forming protocols dominate the high end, choroid-plexus organoids</w:t>
       </w:r>
       <w:r>
         <w:rPr>
@@ -2826,7 +2826,7 @@
         <w:t xml:space="preserve">independent</w:t>
       </w:r>
       <w:r>
-        <w:t xml:space="preserve">, non-HDBCA reference—the prenatal human cortex of Velmeshev</w:t>
+        <w:t xml:space="preserve">, non-HDBCA reference, the prenatal human cortex of Velmeshev</w:t>
       </w:r>
       <w:r>
         <w:t xml:space="preserve"> </w:t>
@@ -2845,7 +2845,7 @@
         <w:t xml:space="preserve">27</w:t>
       </w:r>
       <w:r>
-        <w:t xml:space="preserve">—reasoning that cells merely missing from HDBCA should be recoverable</w:t>
+        <w:t xml:space="preserve">, reasoning that cells merely missing from HDBCA should be recoverable</w:t>
       </w:r>
       <w:r>
         <w:t xml:space="preserve"> </w:t>
@@ -2950,13 +2950,13 @@
         <w:t xml:space="preserve"> </w:t>
       </w:r>
       <w:r>
-        <w:t xml:space="preserve">that shared displacement, and—exactly as in the Aim 3</w:t>
-      </w:r>
-      <w:r>
-        <w:t xml:space="preserve"> </w:t>
-      </w:r>
-      <w:r>
-        <w:t xml:space="preserve">cancellation argument—the clean-versus-ambiguous-novel contrast removes it: ambiguous-novel neural cells</w:t>
+        <w:t xml:space="preserve">that shared displacement, and, exactly as in the Aim 3</w:t>
+      </w:r>
+      <w:r>
+        <w:t xml:space="preserve"> </w:t>
+      </w:r>
+      <w:r>
+        <w:t xml:space="preserve">cancellation argument, the clean-versus-ambiguous-novel contrast removes it: ambiguous-novel neural cells</w:t>
       </w:r>
       <w:r>
         <w:t xml:space="preserve"> </w:t>
@@ -3521,13 +3521,13 @@
         </m:r>
       </m:oMath>
       <w:r>
-        <w:t xml:space="preserve">; and adding a source batch covariate to the decoder—the textbook remedy for a nuisance</w:t>
-      </w:r>
-      <w:r>
-        <w:t xml:space="preserve"> </w:t>
-      </w:r>
-      <w:r>
-        <w:t xml:space="preserve">axis confounded with a condition—gave</w:t>
+        <w:t xml:space="preserve">; and adding a source batch covariate to the decoder, the textbook remedy for a nuisance</w:t>
+      </w:r>
+      <w:r>
+        <w:t xml:space="preserve"> </w:t>
+      </w:r>
+      <w:r>
+        <w:t xml:space="preserve">axis confounded with a condition, gave</w:t>
       </w:r>
       <w:r>
         <w:t xml:space="preserve"> </w:t>
@@ -3614,7 +3614,7 @@
         <w:t xml:space="preserve"> </w:t>
       </w:r>
       <w:r>
-        <w:t xml:space="preserve">defined—the background</w:t>
+        <w:t xml:space="preserve">defined, the background</w:t>
       </w:r>
       <w:r>
         <w:t xml:space="preserve"> </w:t>
@@ -3815,13 +3815,13 @@
         <w:t xml:space="preserve"> </w:t>
       </w:r>
       <w:r>
-        <w:t xml:space="preserve">supports a claim we can fully defend—shared-latent contrastive methods cannot produce a</w:t>
-      </w:r>
-      <w:r>
-        <w:t xml:space="preserve"> </w:t>
-      </w:r>
-      <w:r>
-        <w:t xml:space="preserve">source-invariant lineage axis in this regime—whereas the specifically</w:t>
+        <w:t xml:space="preserve">supports a claim we can fully defend, shared-latent contrastive methods cannot produce a</w:t>
+      </w:r>
+      <w:r>
+        <w:t xml:space="preserve"> </w:t>
+      </w:r>
+      <w:r>
+        <w:t xml:space="preserve">source-invariant lineage axis in this regime, whereas the specifically</w:t>
       </w:r>
       <w:r>
         <w:t xml:space="preserve"> </w:t>
@@ -3878,7 +3878,7 @@
         <w:t xml:space="preserve"> </w:t>
       </w:r>
       <w:r>
-        <w:t xml:space="preserve">The substantive claim is therefore not that a domain gap exists—that is assumed—but a sharper,</w:t>
+        <w:t xml:space="preserve">The substantive claim is therefore not that a domain gap exists, that is assumed, but a sharper,</w:t>
       </w:r>
       <w:r>
         <w:t xml:space="preserve"> </w:t>
@@ -3912,13 +3912,13 @@
         <w:t xml:space="preserve"> </w:t>
       </w:r>
       <w:r>
-        <w:t xml:space="preserve">fetal-versus-organoid regime lies past that boundary. Naming this boundary condition—rather than</w:t>
-      </w:r>
-      <w:r>
-        <w:t xml:space="preserve"> </w:t>
-      </w:r>
-      <w:r>
-        <w:t xml:space="preserve">restating the bare fact that source is decodable—is the contribution, and it identifies encoder-side</w:t>
+        <w:t xml:space="preserve">fetal-versus-organoid regime lies past that boundary. Naming this boundary condition, rather than</w:t>
+      </w:r>
+      <w:r>
+        <w:t xml:space="preserve"> </w:t>
+      </w:r>
+      <w:r>
+        <w:t xml:space="preserve">restating the bare fact that source is decodable, is the contribution, and it identifies encoder-side</w:t>
       </w:r>
       <w:r>
         <w:t xml:space="preserve"> </w:t>
@@ -3988,13 +3988,13 @@
         <w:t xml:space="preserve"> </w:t>
       </w:r>
       <w:r>
-        <w:t xml:space="preserve">coverage gaps); the non-neural contaminants—skeletal and cardiac muscle, fibroblast, and</w:t>
-      </w:r>
-      <w:r>
-        <w:t xml:space="preserve"> </w:t>
-      </w:r>
-      <w:r>
-        <w:t xml:space="preserve">adrenal-cortical cells—instead map to a</w:t>
+        <w:t xml:space="preserve">coverage gaps); the non-neural contaminants, skeletal and cardiac muscle, fibroblast, and</w:t>
+      </w:r>
+      <w:r>
+        <w:t xml:space="preserve"> </w:t>
+      </w:r>
+      <w:r>
+        <w:t xml:space="preserve">adrenal-cortical cells, instead map to a</w:t>
       </w:r>
       <w:r>
         <w:t xml:space="preserve"> </w:t>
@@ -4296,7 +4296,7 @@
         <w:t xml:space="preserve"> </w:t>
       </w:r>
       <w:r>
-        <w:t xml:space="preserve">compared. That constancy is not guaranteed, and it is not the constancy Gate B verified—Gate B</w:t>
+        <w:t xml:space="preserve">compared. That constancy is not guaranteed, and it is not the constancy Gate B verified, Gate B</w:t>
       </w:r>
       <w:r>
         <w:t xml:space="preserve"> </w:t>
@@ -4387,13 +4387,13 @@
         <w:t xml:space="preserve"> </w:t>
       </w:r>
       <w:r>
-        <w:t xml:space="preserve">rely on the constant-offset assumption, we tested it directly—measuring the per-lineage dish vector</w:t>
-      </w:r>
-      <w:r>
-        <w:t xml:space="preserve"> </w:t>
-      </w:r>
-      <w:r>
-        <w:t xml:space="preserve">(organoid minus primary) for each of the four lineages and asking whether they coincide (Methods)—and</w:t>
+        <w:t xml:space="preserve">rely on the constant-offset assumption, we tested it directly, measuring the per-lineage dish vector</w:t>
+      </w:r>
+      <w:r>
+        <w:t xml:space="preserve"> </w:t>
+      </w:r>
+      <w:r>
+        <w:t xml:space="preserve">(organoid minus primary) for each of the four lineages and asking whether they coincide (Methods), and</w:t>
       </w:r>
       <w:r>
         <w:t xml:space="preserve"> </w:t>
@@ -4822,7 +4822,7 @@
         <w:t xml:space="preserve"> </w:t>
       </w:r>
       <w:r>
-        <w:t xml:space="preserve">lineage metrics—the inter-lineage</w:t>
+        <w:t xml:space="preserve">lineage metrics, the inter-lineage</w:t>
       </w:r>
       <w:r>
         <w:t xml:space="preserve"> </w:t>
@@ -5222,7 +5222,7 @@
         <w:t xml:space="preserve">reference-absent</w:t>
       </w:r>
       <w:r>
-        <w:t xml:space="preserve">—non-cortical and later than HDBCA covers—rather than</w:t>
+        <w:t xml:space="preserve">, non-cortical and later than HDBCA covers, rather than</w:t>
       </w:r>
       <w:r>
         <w:t xml:space="preserve"> </w:t>
@@ -5310,13 +5310,13 @@
         <w:t xml:space="preserve"> </w:t>
       </w:r>
       <w:r>
-        <w:t xml:space="preserve">separable nuisance subspace. We show that in this regime it is not—it is a pervasive, encoder-visible</w:t>
-      </w:r>
-      <w:r>
-        <w:t xml:space="preserve"> </w:t>
-      </w:r>
-      <w:r>
-        <w:t xml:space="preserve">shift—so shared-latent methods cannot produce a source-invariant lineage axis regardless of salient</w:t>
+        <w:t xml:space="preserve">separable nuisance subspace. We show that in this regime it is not, it is a pervasive, encoder-visible</w:t>
+      </w:r>
+      <w:r>
+        <w:t xml:space="preserve"> </w:t>
+      </w:r>
+      <w:r>
+        <w:t xml:space="preserve">shift, so shared-latent methods cannot produce a source-invariant lineage axis regardless of salient</w:t>
       </w:r>
       <w:r>
         <w:t xml:space="preserve"> </w:t>
@@ -5354,7 +5354,7 @@
         <w:pStyle w:val="BodyText"/>
       </w:pPr>
       <w:r>
-        <w:t xml:space="preserve">Third, the quantity Aim 3 needs—the</w:t>
+        <w:t xml:space="preserve">Third, the quantity Aim 3 needs, the</w:t>
       </w:r>
       <w:r>
         <w:t xml:space="preserve"> </w:t>
@@ -5370,7 +5370,7 @@
         <w:t xml:space="preserve"> </w:t>
       </w:r>
       <w:r>
-        <w:t xml:space="preserve">geometry of off-target populations—survives the</w:t>
+        <w:t xml:space="preserve">geometry of off-target populations, survives the</w:t>
       </w:r>
       <w:r>
         <w:t xml:space="preserve"> </w:t>
@@ -5462,13 +5462,13 @@
         </m:r>
       </m:oMath>
       <w:r>
-        <w:t xml:space="preserve">). Aim 3 is therefore a working capability with a reference-anchored ordering—a comparison axis</w:t>
-      </w:r>
-      <w:r>
-        <w:t xml:space="preserve"> </w:t>
-      </w:r>
-      <w:r>
-        <w:t xml:space="preserve">whose ranking can be trusted today—rather than a clean lineage geometry or a finished biological</w:t>
+        <w:t xml:space="preserve">). Aim 3 is therefore a working capability with a reference-anchored ordering, a comparison axis</w:t>
+      </w:r>
+      <w:r>
+        <w:t xml:space="preserve"> </w:t>
+      </w:r>
+      <w:r>
+        <w:t xml:space="preserve">whose ranking can be trusted today, rather than a clean lineage geometry or a finished biological</w:t>
       </w:r>
       <w:r>
         <w:t xml:space="preserve"> </w:t>
@@ -5602,7 +5602,7 @@
         <w:t xml:space="preserve"> </w:t>
       </w:r>
       <w:r>
-        <w:t xml:space="preserve">the recovered distances are accordingly confounded, and only their rank order—validated against the</w:t>
+        <w:t xml:space="preserve">the recovered distances are accordingly confounded, and only their rank order, validated against the</w:t>
       </w:r>
       <w:r>
         <w:t xml:space="preserve"> </w:t>
@@ -5625,7 +5625,7 @@
         </m:r>
       </m:oMath>
       <w:r>
-        <w:t xml:space="preserve">)—should be relied on.</w:t>
+        <w:t xml:space="preserve">), should be relied on.</w:t>
       </w:r>
     </w:p>
     <w:p>
@@ -5639,7 +5639,7 @@
         <w:t xml:space="preserve"> </w:t>
       </w:r>
       <w:r>
-        <w:t xml:space="preserve">motivated this work—it reroutes it. The same translation invariance that rescues Aim 3 is itself a way</w:t>
+        <w:t xml:space="preserve">motivated this work, it reroutes it. The same translation invariance that rescues Aim 3 is itself a way</w:t>
       </w:r>
       <w:r>
         <w:t xml:space="preserve"> </w:t>
@@ -5695,7 +5695,7 @@
         <w:t xml:space="preserve"> </w:t>
       </w:r>
       <w:r>
-        <w:t xml:space="preserve">source offset cancels—the construction demonstrated here, with the proviso, made concrete by Aim 3,</w:t>
+        <w:t xml:space="preserve">source offset cancels, the construction demonstrated here, with the proviso, made concrete by Aim 3,</w:t>
       </w:r>
       <w:r>
         <w:t xml:space="preserve"> </w:t>
@@ -5725,19 +5725,19 @@
         <w:t xml:space="preserve"> </w:t>
       </w:r>
       <w:r>
-        <w:t xml:space="preserve">road does not reach it, together with a partly working vehicle—and a clear specification of the</w:t>
-      </w:r>
-      <w:r>
-        <w:t xml:space="preserve"> </w:t>
-      </w:r>
-      <w:r>
-        <w:t xml:space="preserve">remaining repair—for the road that does. Framed as a statement about what is</w:t>
-      </w:r>
-      <w:r>
-        <w:t xml:space="preserve"> </w:t>
-      </w:r>
-      <w:r>
-        <w:t xml:space="preserve">recoverable from which data—an identifiability boundary for calibration without anchoring—the</w:t>
+        <w:t xml:space="preserve">road does not reach it, together with a partly working vehicle, and a clear specification of the</w:t>
+      </w:r>
+      <w:r>
+        <w:t xml:space="preserve"> </w:t>
+      </w:r>
+      <w:r>
+        <w:t xml:space="preserve">remaining repair, for the road that does. Framed as a statement about what is</w:t>
+      </w:r>
+      <w:r>
+        <w:t xml:space="preserve"> </w:t>
+      </w:r>
+      <w:r>
+        <w:t xml:space="preserve">recoverable from which data, an identifiability boundary for calibration without anchoring, the</w:t>
       </w:r>
       <w:r>
         <w:t xml:space="preserve"> </w:t>
@@ -6741,7 +6741,10 @@
         </m:sSub>
       </m:oMath>
       <w:r>
-        <w:t xml:space="preserve">—</w:t>
+        <w:t xml:space="preserve">,</w:t>
+      </w:r>
+      <w:r>
+        <w:t xml:space="preserve"> </w:t>
       </w:r>
       <w:r>
         <w:rPr>
@@ -7041,7 +7044,7 @@
         <w:t xml:space="preserve"> </w:t>
       </w:r>
       <w:r>
-        <w:t xml:space="preserve">calibrated mapping scores—off-manifold distance</w:t>
+        <w:t xml:space="preserve">calibrated mapping scores, off-manifold distance</w:t>
       </w:r>
       <w:r>
         <w:t xml:space="preserve"> </w:t>
@@ -7121,7 +7124,7 @@
         </m:r>
       </m:oMath>
       <w:r>
-        <w:t xml:space="preserve">)—that define a six-state off-target taxonomy, which feeds three analyses: feasibility</w:t>
+        <w:t xml:space="preserve">), that define a six-state off-target taxonomy, which feeds three analyses: feasibility</w:t>
       </w:r>
       <w:r>
         <w:t xml:space="preserve"> </w:t>
@@ -8360,7 +8363,7 @@
         <w:t xml:space="preserve"> </w:t>
       </w:r>
       <w:r>
-        <w:t xml:space="preserve">organoid cells—including clean cells—far from the reference (clean/ambiguous</w:t>
+        <w:t xml:space="preserve">organoid cells, including clean cells, far from the reference (clean/ambiguous</w:t>
       </w:r>
       <w:r>
         <w:t xml:space="preserve"> </w:t>

</xml_diff>

<commit_message>
Add Data and code availability section (Zenodo DOI + GitHub + CELLxGENE IDs); rebuild PDF/DOCX
- main.tex: new unnumbered "Data and code availability" section after Methods, citing the
  CZ CELLxGENE dataset identifiers, the code repository, and the Zenodo archive
  https://doi.org/10.5281/zenodo.21459720; notes the large inputs are regenerable, not deposited.
- Rebuilt main.pdf (19pp) and main.docx; both verified to contain the section, the DOI, the
  repository URL, and zero em dashes.
- Toolchain note: PDF/DOCX now build LOCALLY (tectonic + pandoc installed to ~/.local/bin);
  a remote pod is no longer required for compilation.
</commit_message>
<xml_diff>
--- a/docs/manuscript/main.docx
+++ b/docs/manuscript/main.docx
@@ -31,7 +31,7 @@
         <w:pStyle w:val="Date"/>
       </w:pPr>
       <w:r>
-        <w:t xml:space="preserve">2026-06-18</w:t>
+        <w:t xml:space="preserve">2026-07-20</w:t>
       </w:r>
     </w:p>
     <w:p>
@@ -5747,7 +5747,7 @@
       </w:r>
     </w:p>
     <w:bookmarkEnd w:id="15"/>
-    <w:bookmarkStart w:id="110" w:name="methods"/>
+    <w:bookmarkStart w:id="25" w:name="methods"/>
     <w:p>
       <w:pPr>
         <w:pStyle w:val="Heading1"/>
@@ -6878,7 +6878,7 @@
       </w:r>
     </w:p>
     <w:bookmarkEnd w:id="23"/>
-    <w:bookmarkStart w:id="109" w:name="compute-and-code."/>
+    <w:bookmarkStart w:id="24" w:name="compute-and-code."/>
     <w:p>
       <w:pPr>
         <w:pStyle w:val="Heading4"/>
@@ -6928,7 +6928,162 @@
         <w:t xml:space="preserve">.</w:t>
       </w:r>
     </w:p>
-    <w:bookmarkStart w:id="27" w:name="fig:overview"/>
+    <w:bookmarkEnd w:id="24"/>
+    <w:bookmarkEnd w:id="25"/>
+    <w:bookmarkStart w:id="113" w:name="data-and-code-availability"/>
+    <w:p>
+      <w:pPr>
+        <w:pStyle w:val="Heading1"/>
+      </w:pPr>
+      <w:r>
+        <w:t xml:space="preserve">Data and code availability</w:t>
+      </w:r>
+    </w:p>
+    <w:p>
+      <w:pPr>
+        <w:pStyle w:val="FirstParagraph"/>
+      </w:pPr>
+      <w:r>
+        <w:t xml:space="preserve">All primary data are public. The Human Neural Organoid Atlas, the first-trimester human brain cell</w:t>
+      </w:r>
+      <w:r>
+        <w:t xml:space="preserve"> </w:t>
+      </w:r>
+      <w:r>
+        <w:t xml:space="preserve">atlas, the human fetal-body atlas, and the independent prenatal cortex atlas of Velmeshev</w:t>
+      </w:r>
+      <w:r>
+        <w:t xml:space="preserve"> </w:t>
+      </w:r>
+      <w:r>
+        <w:rPr>
+          <w:i/>
+          <w:iCs/>
+        </w:rPr>
+        <w:t xml:space="preserve">et al.</w:t>
+      </w:r>
+      <w:r>
+        <w:t xml:space="preserve"> </w:t>
+      </w:r>
+      <w:r>
+        <w:t xml:space="preserve">were obtained from CZ CELLxGENE Discover</w:t>
+      </w:r>
+      <w:r>
+        <w:rPr>
+          <w:vertAlign w:val="superscript"/>
+        </w:rPr>
+        <w:t xml:space="preserve">15</w:t>
+      </w:r>
+      <w:r>
+        <w:t xml:space="preserve"> </w:t>
+      </w:r>
+      <w:r>
+        <w:t xml:space="preserve">(dataset identifiers</w:t>
+      </w:r>
+      <w:r>
+        <w:t xml:space="preserve"> </w:t>
+      </w:r>
+      <w:r>
+        <w:rPr>
+          <w:rStyle w:val="VerbatimChar"/>
+        </w:rPr>
+        <w:t xml:space="preserve">3a805b8d</w:t>
+      </w:r>
+      <w:r>
+        <w:t xml:space="preserve">,</w:t>
+      </w:r>
+      <w:r>
+        <w:t xml:space="preserve"> </w:t>
+      </w:r>
+      <w:r>
+        <w:rPr>
+          <w:rStyle w:val="VerbatimChar"/>
+        </w:rPr>
+        <w:t xml:space="preserve">13149914</w:t>
+      </w:r>
+      <w:r>
+        <w:t xml:space="preserve">, and</w:t>
+      </w:r>
+      <w:r>
+        <w:t xml:space="preserve"> </w:t>
+      </w:r>
+      <w:r>
+        <w:rPr>
+          <w:rStyle w:val="VerbatimChar"/>
+        </w:rPr>
+        <w:t xml:space="preserve">1a38e762-2465-418f-b81c-6a4bce261c34</w:t>
+      </w:r>
+      <w:r>
+        <w:t xml:space="preserve">,</w:t>
+      </w:r>
+      <w:r>
+        <w:t xml:space="preserve"> </w:t>
+      </w:r>
+      <w:r>
+        <w:t xml:space="preserve">respectively).</w:t>
+      </w:r>
+    </w:p>
+    <w:p>
+      <w:pPr>
+        <w:pStyle w:val="BodyText"/>
+      </w:pPr>
+      <w:r>
+        <w:t xml:space="preserve">Analysis code, unit tests, and the figure-generation scripts are available at</w:t>
+      </w:r>
+      <w:r>
+        <w:t xml:space="preserve"> </w:t>
+      </w:r>
+      <w:hyperlink r:id="rId26">
+        <w:r>
+          <w:rPr>
+            <w:rStyle w:val="Hyperlink"/>
+          </w:rPr>
+          <w:t xml:space="preserve">https://github.com/LTTakahashi/NullState</w:t>
+        </w:r>
+      </w:hyperlink>
+      <w:r>
+        <w:t xml:space="preserve">. Derived data supporting every quantitative claim,</w:t>
+      </w:r>
+      <w:r>
+        <w:t xml:space="preserve"> </w:t>
+      </w:r>
+      <w:r>
+        <w:t xml:space="preserve">including the background latent used for the geometry analysis, the per-cell cross-atlas scores, the</w:t>
+      </w:r>
+      <w:r>
+        <w:t xml:space="preserve"> </w:t>
+      </w:r>
+      <w:r>
+        <w:t xml:space="preserve">run logs, and Supplementary Tables S1 to S6, are archived at Zenodo,</w:t>
+      </w:r>
+      <w:r>
+        <w:t xml:space="preserve"> </w:t>
+      </w:r>
+      <w:hyperlink r:id="rId27">
+        <w:r>
+          <w:rPr>
+            <w:rStyle w:val="Hyperlink"/>
+          </w:rPr>
+          <w:t xml:space="preserve">https://doi.org/10.5281/zenodo.21459720</w:t>
+        </w:r>
+      </w:hyperlink>
+      <w:r>
+        <w:t xml:space="preserve">. The harmonized reference (approximately 12 GB), the</w:t>
+      </w:r>
+      <w:r>
+        <w:t xml:space="preserve"> </w:t>
+      </w:r>
+      <w:r>
+        <w:t xml:space="preserve">annotated query (approximately 9 GB), and the trained models are not deposited because of size; they</w:t>
+      </w:r>
+      <w:r>
+        <w:t xml:space="preserve"> </w:t>
+      </w:r>
+      <w:r>
+        <w:t xml:space="preserve">are regenerable from the public inputs above using the pipeline in the repository.</w:t>
+      </w:r>
+    </w:p>
+    <w:bookmarkStart w:id="31" w:name="fig:overview"/>
     <w:p>
       <w:pPr>
         <w:pStyle w:val="CaptionedFigure"/>
@@ -6938,18 +7093,18 @@
           <wp:inline>
             <wp:extent cx="5334000" cy="3520818"/>
             <wp:effectExtent b="0" l="0" r="0" t="0"/>
-            <wp:docPr descr="" title="" id="25" name="Picture"/>
+            <wp:docPr descr="" title="" id="29" name="Picture"/>
             <a:graphic>
               <a:graphicData uri="http://schemas.openxmlformats.org/drawingml/2006/picture">
                 <pic:pic>
                   <pic:nvPicPr>
-                    <pic:cNvPr descr="figs/fig1.png" id="26" name="Picture"/>
+                    <pic:cNvPr descr="figs/fig1.png" id="30" name="Picture"/>
                     <pic:cNvPicPr>
                       <a:picLocks noChangeArrowheads="1" noChangeAspect="1"/>
                     </pic:cNvPicPr>
                   </pic:nvPicPr>
                   <pic:blipFill>
-                    <a:blip r:embed="rId24"/>
+                    <a:blip r:embed="rId28"/>
                     <a:stretch>
                       <a:fillRect/>
                     </a:stretch>
@@ -7133,8 +7288,8 @@
         <w:t xml:space="preserve">gates (Aim 1), lineage–dish disentanglement (Aim 2), and off-target geometry (Aim 3).</w:t>
       </w:r>
     </w:p>
-    <w:bookmarkEnd w:id="27"/>
-    <w:bookmarkStart w:id="31" w:name="fig:aim1"/>
+    <w:bookmarkEnd w:id="31"/>
+    <w:bookmarkStart w:id="35" w:name="fig:aim1"/>
     <w:p>
       <w:pPr>
         <w:pStyle w:val="CaptionedFigure"/>
@@ -7144,18 +7299,18 @@
           <wp:inline>
             <wp:extent cx="5334000" cy="3628868"/>
             <wp:effectExtent b="0" l="0" r="0" t="0"/>
-            <wp:docPr descr="" title="" id="29" name="Picture"/>
+            <wp:docPr descr="" title="" id="33" name="Picture"/>
             <a:graphic>
               <a:graphicData uri="http://schemas.openxmlformats.org/drawingml/2006/picture">
                 <pic:pic>
                   <pic:nvPicPr>
-                    <pic:cNvPr descr="figs/fig2.png" id="30" name="Picture"/>
+                    <pic:cNvPr descr="figs/fig2.png" id="34" name="Picture"/>
                     <pic:cNvPicPr>
                       <a:picLocks noChangeArrowheads="1" noChangeAspect="1"/>
                     </pic:cNvPicPr>
                   </pic:nvPicPr>
                   <pic:blipFill>
-                    <a:blip r:embed="rId28"/>
+                    <a:blip r:embed="rId32"/>
                     <a:stretch>
                       <a:fillRect/>
                     </a:stretch>
@@ -7449,8 +7604,8 @@
         <w:t xml:space="preserve">), and off-target power (C, green).</w:t>
       </w:r>
     </w:p>
-    <w:bookmarkEnd w:id="31"/>
-    <w:bookmarkStart w:id="35" w:name="fig:diag"/>
+    <w:bookmarkEnd w:id="35"/>
+    <w:bookmarkStart w:id="39" w:name="fig:diag"/>
     <w:p>
       <w:pPr>
         <w:pStyle w:val="CaptionedFigure"/>
@@ -7460,18 +7615,18 @@
           <wp:inline>
             <wp:extent cx="4907280" cy="4521891"/>
             <wp:effectExtent b="0" l="0" r="0" t="0"/>
-            <wp:docPr descr="" title="" id="33" name="Picture"/>
+            <wp:docPr descr="" title="" id="37" name="Picture"/>
             <a:graphic>
               <a:graphicData uri="http://schemas.openxmlformats.org/drawingml/2006/picture">
                 <pic:pic>
                   <pic:nvPicPr>
-                    <pic:cNvPr descr="figs/fig3.png" id="34" name="Picture"/>
+                    <pic:cNvPr descr="figs/fig3.png" id="38" name="Picture"/>
                     <pic:cNvPicPr>
                       <a:picLocks noChangeArrowheads="1" noChangeAspect="1"/>
                     </pic:cNvPicPr>
                   </pic:nvPicPr>
                   <pic:blipFill>
-                    <a:blip r:embed="rId32"/>
+                    <a:blip r:embed="rId36"/>
                     <a:stretch>
                       <a:fillRect/>
                     </a:stretch>
@@ -7665,8 +7820,8 @@
         <w:t xml:space="preserve">) scPoli UMAP coloured by class: ambiguous-novel cells occupy contiguous territory.</w:t>
       </w:r>
     </w:p>
-    <w:bookmarkEnd w:id="35"/>
-    <w:bookmarkStart w:id="39" w:name="fig:aim2"/>
+    <w:bookmarkEnd w:id="39"/>
+    <w:bookmarkStart w:id="43" w:name="fig:aim2"/>
     <w:p>
       <w:pPr>
         <w:pStyle w:val="CaptionedFigure"/>
@@ -7676,18 +7831,18 @@
           <wp:inline>
             <wp:extent cx="5334000" cy="2418806"/>
             <wp:effectExtent b="0" l="0" r="0" t="0"/>
-            <wp:docPr descr="" title="" id="37" name="Picture"/>
+            <wp:docPr descr="" title="" id="41" name="Picture"/>
             <a:graphic>
               <a:graphicData uri="http://schemas.openxmlformats.org/drawingml/2006/picture">
                 <pic:pic>
                   <pic:nvPicPr>
-                    <pic:cNvPr descr="figs/fig4.png" id="38" name="Picture"/>
+                    <pic:cNvPr descr="figs/fig4.png" id="42" name="Picture"/>
                     <pic:cNvPicPr>
                       <a:picLocks noChangeArrowheads="1" noChangeAspect="1"/>
                     </pic:cNvPicPr>
                   </pic:nvPicPr>
                   <pic:blipFill>
-                    <a:blip r:embed="rId36"/>
+                    <a:blip r:embed="rId40"/>
                     <a:stretch>
                       <a:fillRect/>
                     </a:stretch>
@@ -7897,8 +8052,8 @@
         <w:t xml:space="preserve">encode source directly; decoder batch-conditioning cannot remove it.</w:t>
       </w:r>
     </w:p>
-    <w:bookmarkEnd w:id="39"/>
-    <w:bookmarkStart w:id="43" w:name="fig:aim3"/>
+    <w:bookmarkEnd w:id="43"/>
+    <w:bookmarkStart w:id="47" w:name="fig:aim3"/>
     <w:p>
       <w:pPr>
         <w:pStyle w:val="CaptionedFigure"/>
@@ -7908,18 +8063,18 @@
           <wp:inline>
             <wp:extent cx="5334000" cy="3634777"/>
             <wp:effectExtent b="0" l="0" r="0" t="0"/>
-            <wp:docPr descr="" title="" id="41" name="Picture"/>
+            <wp:docPr descr="" title="" id="45" name="Picture"/>
             <a:graphic>
               <a:graphicData uri="http://schemas.openxmlformats.org/drawingml/2006/picture">
                 <pic:pic>
                   <pic:nvPicPr>
-                    <pic:cNvPr descr="figs/fig5.png" id="42" name="Picture"/>
+                    <pic:cNvPr descr="figs/fig5.png" id="46" name="Picture"/>
                     <pic:cNvPicPr>
                       <a:picLocks noChangeArrowheads="1" noChangeAspect="1"/>
                     </pic:cNvPicPr>
                   </pic:nvPicPr>
                   <pic:blipFill>
-                    <a:blip r:embed="rId40"/>
+                    <a:blip r:embed="rId44"/>
                     <a:stretch>
                       <a:fillRect/>
                     </a:stretch>
@@ -8205,8 +8360,8 @@
         <w:t xml:space="preserve">is not a clean lineage distance.</w:t>
       </w:r>
     </w:p>
-    <w:bookmarkEnd w:id="43"/>
-    <w:bookmarkStart w:id="47" w:name="fig:ref2"/>
+    <w:bookmarkEnd w:id="47"/>
+    <w:bookmarkStart w:id="51" w:name="fig:ref2"/>
     <w:p>
       <w:pPr>
         <w:pStyle w:val="CaptionedFigure"/>
@@ -8216,18 +8371,18 @@
           <wp:inline>
             <wp:extent cx="5120640" cy="2377153"/>
             <wp:effectExtent b="0" l="0" r="0" t="0"/>
-            <wp:docPr descr="" title="" id="45" name="Picture"/>
+            <wp:docPr descr="" title="" id="49" name="Picture"/>
             <a:graphic>
               <a:graphicData uri="http://schemas.openxmlformats.org/drawingml/2006/picture">
                 <pic:pic>
                   <pic:nvPicPr>
-                    <pic:cNvPr descr="figs/fig6.png" id="46" name="Picture"/>
+                    <pic:cNvPr descr="figs/fig6.png" id="50" name="Picture"/>
                     <pic:cNvPicPr>
                       <a:picLocks noChangeArrowheads="1" noChangeAspect="1"/>
                     </pic:cNvPicPr>
                   </pic:nvPicPr>
                   <pic:blipFill>
-                    <a:blip r:embed="rId44"/>
+                    <a:blip r:embed="rId48"/>
                     <a:stretch>
                       <a:fillRect/>
                     </a:stretch>
@@ -8551,9 +8706,9 @@
         <w:t xml:space="preserve">), isolating a genuine in-vitro-divergence component.</w:t>
       </w:r>
     </w:p>
-    <w:bookmarkEnd w:id="47"/>
-    <w:bookmarkStart w:id="108" w:name="refs"/>
-    <w:bookmarkStart w:id="49" w:name="ref-lancaster2013organoids"/>
+    <w:bookmarkEnd w:id="51"/>
+    <w:bookmarkStart w:id="112" w:name="refs"/>
+    <w:bookmarkStart w:id="53" w:name="ref-lancaster2013organoids"/>
     <w:p>
       <w:pPr>
         <w:pStyle w:val="Bibliography"/>
@@ -8583,7 +8738,7 @@
       <w:r>
         <w:t xml:space="preserve"> </w:t>
       </w:r>
-      <w:hyperlink r:id="rId48">
+      <w:hyperlink r:id="rId52">
         <w:r>
           <w:rPr>
             <w:rStyle w:val="Hyperlink"/>
@@ -8618,8 +8773,8 @@
         <w:t xml:space="preserve">, 373–379 (2013).</w:t>
       </w:r>
     </w:p>
-    <w:bookmarkEnd w:id="49"/>
-    <w:bookmarkStart w:id="51" w:name="ref-pasca2015cortical"/>
+    <w:bookmarkEnd w:id="53"/>
+    <w:bookmarkStart w:id="55" w:name="ref-pasca2015cortical"/>
     <w:p>
       <w:pPr>
         <w:pStyle w:val="Bibliography"/>
@@ -8649,7 +8804,7 @@
       <w:r>
         <w:t xml:space="preserve"> </w:t>
       </w:r>
-      <w:hyperlink r:id="rId50">
+      <w:hyperlink r:id="rId54">
         <w:r>
           <w:rPr>
             <w:rStyle w:val="Hyperlink"/>
@@ -8684,8 +8839,8 @@
         <w:t xml:space="preserve">, 671–678 (2015).</w:t>
       </w:r>
     </w:p>
-    <w:bookmarkEnd w:id="51"/>
-    <w:bookmarkStart w:id="53" w:name="ref-quadrato2017organoids"/>
+    <w:bookmarkEnd w:id="55"/>
+    <w:bookmarkStart w:id="57" w:name="ref-quadrato2017organoids"/>
     <w:p>
       <w:pPr>
         <w:pStyle w:val="Bibliography"/>
@@ -8715,7 +8870,7 @@
       <w:r>
         <w:t xml:space="preserve"> </w:t>
       </w:r>
-      <w:hyperlink r:id="rId52">
+      <w:hyperlink r:id="rId56">
         <w:r>
           <w:rPr>
             <w:rStyle w:val="Hyperlink"/>
@@ -8750,8 +8905,8 @@
         <w:t xml:space="preserve">, 48–53 (2017).</w:t>
       </w:r>
     </w:p>
-    <w:bookmarkEnd w:id="53"/>
-    <w:bookmarkStart w:id="55" w:name="ref-velasco2019organoids"/>
+    <w:bookmarkEnd w:id="57"/>
+    <w:bookmarkStart w:id="59" w:name="ref-velasco2019organoids"/>
     <w:p>
       <w:pPr>
         <w:pStyle w:val="Bibliography"/>
@@ -8781,7 +8936,7 @@
       <w:r>
         <w:t xml:space="preserve"> </w:t>
       </w:r>
-      <w:hyperlink r:id="rId54">
+      <w:hyperlink r:id="rId58">
         <w:r>
           <w:rPr>
             <w:rStyle w:val="Hyperlink"/>
@@ -8816,8 +8971,8 @@
         <w:t xml:space="preserve">, 523–527 (2019).</w:t>
       </w:r>
     </w:p>
-    <w:bookmarkEnd w:id="55"/>
-    <w:bookmarkStart w:id="57" w:name="ref-trujillo2019oscillatory"/>
+    <w:bookmarkEnd w:id="59"/>
+    <w:bookmarkStart w:id="61" w:name="ref-trujillo2019oscillatory"/>
     <w:p>
       <w:pPr>
         <w:pStyle w:val="Bibliography"/>
@@ -8847,7 +9002,7 @@
       <w:r>
         <w:t xml:space="preserve"> </w:t>
       </w:r>
-      <w:hyperlink r:id="rId56">
+      <w:hyperlink r:id="rId60">
         <w:r>
           <w:rPr>
             <w:rStyle w:val="Hyperlink"/>
@@ -8882,8 +9037,8 @@
         <w:t xml:space="preserve">, 558–569.e7 (2019).</w:t>
       </w:r>
     </w:p>
-    <w:bookmarkEnd w:id="57"/>
-    <w:bookmarkStart w:id="59" w:name="ref-bhaduri2020stress"/>
+    <w:bookmarkEnd w:id="61"/>
+    <w:bookmarkStart w:id="63" w:name="ref-bhaduri2020stress"/>
     <w:p>
       <w:pPr>
         <w:pStyle w:val="Bibliography"/>
@@ -8913,7 +9068,7 @@
       <w:r>
         <w:t xml:space="preserve"> </w:t>
       </w:r>
-      <w:hyperlink r:id="rId58">
+      <w:hyperlink r:id="rId62">
         <w:r>
           <w:rPr>
             <w:rStyle w:val="Hyperlink"/>
@@ -8948,8 +9103,8 @@
         <w:t xml:space="preserve">, 142–148 (2020).</w:t>
       </w:r>
     </w:p>
-    <w:bookmarkEnd w:id="59"/>
-    <w:bookmarkStart w:id="61" w:name="ref-tanaka2020synthetic"/>
+    <w:bookmarkEnd w:id="63"/>
+    <w:bookmarkStart w:id="65" w:name="ref-tanaka2020synthetic"/>
     <w:p>
       <w:pPr>
         <w:pStyle w:val="Bibliography"/>
@@ -8969,7 +9124,7 @@
       <w:r>
         <w:t xml:space="preserve"> </w:t>
       </w:r>
-      <w:hyperlink r:id="rId60">
+      <w:hyperlink r:id="rId64">
         <w:r>
           <w:rPr>
             <w:rStyle w:val="Hyperlink"/>
@@ -9004,8 +9159,8 @@
         <w:t xml:space="preserve">, 1682–1689.e3 (2020).</w:t>
       </w:r>
     </w:p>
-    <w:bookmarkEnd w:id="61"/>
-    <w:bookmarkStart w:id="63" w:name="ref-kanton2019atlas"/>
+    <w:bookmarkEnd w:id="65"/>
+    <w:bookmarkStart w:id="67" w:name="ref-kanton2019atlas"/>
     <w:p>
       <w:pPr>
         <w:pStyle w:val="Bibliography"/>
@@ -9035,7 +9190,7 @@
       <w:r>
         <w:t xml:space="preserve"> </w:t>
       </w:r>
-      <w:hyperlink r:id="rId62">
+      <w:hyperlink r:id="rId66">
         <w:r>
           <w:rPr>
             <w:rStyle w:val="Hyperlink"/>
@@ -9070,8 +9225,8 @@
         <w:t xml:space="preserve">, 418–422 (2019).</w:t>
       </w:r>
     </w:p>
-    <w:bookmarkEnd w:id="63"/>
-    <w:bookmarkStart w:id="65" w:name="ref-he2024hnoca"/>
+    <w:bookmarkEnd w:id="67"/>
+    <w:bookmarkStart w:id="69" w:name="ref-he2024hnoca"/>
     <w:p>
       <w:pPr>
         <w:pStyle w:val="Bibliography"/>
@@ -9101,7 +9256,7 @@
       <w:r>
         <w:t xml:space="preserve"> </w:t>
       </w:r>
-      <w:hyperlink r:id="rId64">
+      <w:hyperlink r:id="rId68">
         <w:r>
           <w:rPr>
             <w:rStyle w:val="Hyperlink"/>
@@ -9136,8 +9291,8 @@
         <w:t xml:space="preserve">, 690–698 (2024).</w:t>
       </w:r>
     </w:p>
-    <w:bookmarkEnd w:id="65"/>
-    <w:bookmarkStart w:id="67" w:name="ref-braun2023hdbca"/>
+    <w:bookmarkEnd w:id="69"/>
+    <w:bookmarkStart w:id="71" w:name="ref-braun2023hdbca"/>
     <w:p>
       <w:pPr>
         <w:pStyle w:val="Bibliography"/>
@@ -9167,7 +9322,7 @@
       <w:r>
         <w:t xml:space="preserve"> </w:t>
       </w:r>
-      <w:hyperlink r:id="rId66">
+      <w:hyperlink r:id="rId70">
         <w:r>
           <w:rPr>
             <w:rStyle w:val="Hyperlink"/>
@@ -9202,8 +9357,8 @@
         <w:t xml:space="preserve">, eadf1226 (2023).</w:t>
       </w:r>
     </w:p>
-    <w:bookmarkEnd w:id="67"/>
-    <w:bookmarkStart w:id="69" w:name="ref-cao2020fetal"/>
+    <w:bookmarkEnd w:id="71"/>
+    <w:bookmarkStart w:id="73" w:name="ref-cao2020fetal"/>
     <w:p>
       <w:pPr>
         <w:pStyle w:val="Bibliography"/>
@@ -9233,7 +9388,7 @@
       <w:r>
         <w:t xml:space="preserve"> </w:t>
       </w:r>
-      <w:hyperlink r:id="rId68">
+      <w:hyperlink r:id="rId72">
         <w:r>
           <w:rPr>
             <w:rStyle w:val="Hyperlink"/>
@@ -9268,8 +9423,8 @@
         <w:t xml:space="preserve">, eaba7721 (2020).</w:t>
       </w:r>
     </w:p>
-    <w:bookmarkEnd w:id="69"/>
-    <w:bookmarkStart w:id="71" w:name="ref-lopez2018scvi"/>
+    <w:bookmarkEnd w:id="73"/>
+    <w:bookmarkStart w:id="75" w:name="ref-lopez2018scvi"/>
     <w:p>
       <w:pPr>
         <w:pStyle w:val="Bibliography"/>
@@ -9289,7 +9444,7 @@
       <w:r>
         <w:t xml:space="preserve"> </w:t>
       </w:r>
-      <w:hyperlink r:id="rId70">
+      <w:hyperlink r:id="rId74">
         <w:r>
           <w:rPr>
             <w:rStyle w:val="Hyperlink"/>
@@ -9324,8 +9479,8 @@
         <w:t xml:space="preserve">, 1053–1058 (2018).</w:t>
       </w:r>
     </w:p>
-    <w:bookmarkEnd w:id="71"/>
-    <w:bookmarkStart w:id="73" w:name="ref-xu2021scanvi"/>
+    <w:bookmarkEnd w:id="75"/>
+    <w:bookmarkStart w:id="77" w:name="ref-xu2021scanvi"/>
     <w:p>
       <w:pPr>
         <w:pStyle w:val="Bibliography"/>
@@ -9355,7 +9510,7 @@
       <w:r>
         <w:t xml:space="preserve"> </w:t>
       </w:r>
-      <w:hyperlink r:id="rId72">
+      <w:hyperlink r:id="rId76">
         <w:r>
           <w:rPr>
             <w:rStyle w:val="Hyperlink"/>
@@ -9390,8 +9545,8 @@
         <w:t xml:space="preserve">, e9620 (2021).</w:t>
       </w:r>
     </w:p>
-    <w:bookmarkEnd w:id="73"/>
-    <w:bookmarkStart w:id="75" w:name="ref-lotfollahi2022scarches"/>
+    <w:bookmarkEnd w:id="77"/>
+    <w:bookmarkStart w:id="79" w:name="ref-lotfollahi2022scarches"/>
     <w:p>
       <w:pPr>
         <w:pStyle w:val="Bibliography"/>
@@ -9421,7 +9576,7 @@
       <w:r>
         <w:t xml:space="preserve"> </w:t>
       </w:r>
-      <w:hyperlink r:id="rId74">
+      <w:hyperlink r:id="rId78">
         <w:r>
           <w:rPr>
             <w:rStyle w:val="Hyperlink"/>
@@ -9456,8 +9611,8 @@
         <w:t xml:space="preserve">, 121–130 (2022).</w:t>
       </w:r>
     </w:p>
-    <w:bookmarkEnd w:id="75"/>
-    <w:bookmarkStart w:id="77" w:name="ref-czi2025cellxgene"/>
+    <w:bookmarkEnd w:id="79"/>
+    <w:bookmarkStart w:id="81" w:name="ref-czi2025cellxgene"/>
     <w:p>
       <w:pPr>
         <w:pStyle w:val="Bibliography"/>
@@ -9477,7 +9632,7 @@
       <w:r>
         <w:t xml:space="preserve"> </w:t>
       </w:r>
-      <w:hyperlink r:id="rId76">
+      <w:hyperlink r:id="rId80">
         <w:r>
           <w:rPr>
             <w:rStyle w:val="Hyperlink"/>
@@ -9518,8 +9673,8 @@
         <w:t xml:space="preserve">, D886–D900 (2025).</w:t>
       </w:r>
     </w:p>
-    <w:bookmarkEnd w:id="77"/>
-    <w:bookmarkStart w:id="79" w:name="ref-gayoso2022scvitools"/>
+    <w:bookmarkEnd w:id="81"/>
+    <w:bookmarkStart w:id="83" w:name="ref-gayoso2022scvitools"/>
     <w:p>
       <w:pPr>
         <w:pStyle w:val="Bibliography"/>
@@ -9549,7 +9704,7 @@
       <w:r>
         <w:t xml:space="preserve"> </w:t>
       </w:r>
-      <w:hyperlink r:id="rId78">
+      <w:hyperlink r:id="rId82">
         <w:r>
           <w:rPr>
             <w:rStyle w:val="Hyperlink"/>
@@ -9608,8 +9763,8 @@
         <w:t xml:space="preserve">, 163–166 (2022).</w:t>
       </w:r>
     </w:p>
-    <w:bookmarkEnd w:id="79"/>
-    <w:bookmarkStart w:id="81" w:name="ref-korsunsky2019harmony"/>
+    <w:bookmarkEnd w:id="83"/>
+    <w:bookmarkStart w:id="85" w:name="ref-korsunsky2019harmony"/>
     <w:p>
       <w:pPr>
         <w:pStyle w:val="Bibliography"/>
@@ -9639,7 +9794,7 @@
       <w:r>
         <w:t xml:space="preserve"> </w:t>
       </w:r>
-      <w:hyperlink r:id="rId80">
+      <w:hyperlink r:id="rId84">
         <w:r>
           <w:rPr>
             <w:rStyle w:val="Hyperlink"/>
@@ -9686,8 +9841,8 @@
         <w:t xml:space="preserve">, 1289–1296 (2019).</w:t>
       </w:r>
     </w:p>
-    <w:bookmarkEnd w:id="81"/>
-    <w:bookmarkStart w:id="83" w:name="ref-luecken2022scib"/>
+    <w:bookmarkEnd w:id="85"/>
+    <w:bookmarkStart w:id="87" w:name="ref-luecken2022scib"/>
     <w:p>
       <w:pPr>
         <w:pStyle w:val="Bibliography"/>
@@ -9717,7 +9872,7 @@
       <w:r>
         <w:t xml:space="preserve"> </w:t>
       </w:r>
-      <w:hyperlink r:id="rId82">
+      <w:hyperlink r:id="rId86">
         <w:r>
           <w:rPr>
             <w:rStyle w:val="Hyperlink"/>
@@ -9752,8 +9907,8 @@
         <w:t xml:space="preserve">, 41–50 (2022).</w:t>
       </w:r>
     </w:p>
-    <w:bookmarkEnd w:id="83"/>
-    <w:bookmarkStart w:id="85" w:name="ref-buffa2010hypoxia"/>
+    <w:bookmarkEnd w:id="87"/>
+    <w:bookmarkStart w:id="89" w:name="ref-buffa2010hypoxia"/>
     <w:p>
       <w:pPr>
         <w:pStyle w:val="Bibliography"/>
@@ -9773,7 +9928,7 @@
       <w:r>
         <w:t xml:space="preserve"> </w:t>
       </w:r>
-      <w:hyperlink r:id="rId84">
+      <w:hyperlink r:id="rId88">
         <w:r>
           <w:rPr>
             <w:rStyle w:val="Hyperlink"/>
@@ -9808,8 +9963,8 @@
         <w:t xml:space="preserve">, 428–435 (2010).</w:t>
       </w:r>
     </w:p>
-    <w:bookmarkEnd w:id="85"/>
-    <w:bookmarkStart w:id="87" w:name="ref-gulati2020cytotrace"/>
+    <w:bookmarkEnd w:id="89"/>
+    <w:bookmarkStart w:id="91" w:name="ref-gulati2020cytotrace"/>
     <w:p>
       <w:pPr>
         <w:pStyle w:val="Bibliography"/>
@@ -9839,7 +9994,7 @@
       <w:r>
         <w:t xml:space="preserve"> </w:t>
       </w:r>
-      <w:hyperlink r:id="rId86">
+      <w:hyperlink r:id="rId90">
         <w:r>
           <w:rPr>
             <w:rStyle w:val="Hyperlink"/>
@@ -9874,8 +10029,8 @@
         <w:t xml:space="preserve">, 405–411 (2020).</w:t>
       </w:r>
     </w:p>
-    <w:bookmarkEnd w:id="87"/>
-    <w:bookmarkStart w:id="89" w:name="ref-andersen2020corticomotor"/>
+    <w:bookmarkEnd w:id="91"/>
+    <w:bookmarkStart w:id="93" w:name="ref-andersen2020corticomotor"/>
     <w:p>
       <w:pPr>
         <w:pStyle w:val="Bibliography"/>
@@ -9905,7 +10060,7 @@
       <w:r>
         <w:t xml:space="preserve"> </w:t>
       </w:r>
-      <w:hyperlink r:id="rId88">
+      <w:hyperlink r:id="rId92">
         <w:r>
           <w:rPr>
             <w:rStyle w:val="Hyperlink"/>
@@ -9940,8 +10095,8 @@
         <w:t xml:space="preserve">, 1913–1929.e26 (2020).</w:t>
       </w:r>
     </w:p>
-    <w:bookmarkEnd w:id="89"/>
-    <w:bookmarkStart w:id="91" w:name="ref-pellegrini2020csf"/>
+    <w:bookmarkEnd w:id="93"/>
+    <w:bookmarkStart w:id="95" w:name="ref-pellegrini2020csf"/>
     <w:p>
       <w:pPr>
         <w:pStyle w:val="Bibliography"/>
@@ -9971,7 +10126,7 @@
       <w:r>
         <w:t xml:space="preserve"> </w:t>
       </w:r>
-      <w:hyperlink r:id="rId90">
+      <w:hyperlink r:id="rId94">
         <w:r>
           <w:rPr>
             <w:rStyle w:val="Hyperlink"/>
@@ -10030,8 +10185,8 @@
         <w:t xml:space="preserve">, eaaz5626 (2020).</w:t>
       </w:r>
     </w:p>
-    <w:bookmarkEnd w:id="91"/>
-    <w:bookmarkStart w:id="93" w:name="ref-fiorenzano2021midbrain"/>
+    <w:bookmarkEnd w:id="95"/>
+    <w:bookmarkStart w:id="97" w:name="ref-fiorenzano2021midbrain"/>
     <w:p>
       <w:pPr>
         <w:pStyle w:val="Bibliography"/>
@@ -10061,7 +10216,7 @@
       <w:r>
         <w:t xml:space="preserve"> </w:t>
       </w:r>
-      <w:hyperlink r:id="rId92">
+      <w:hyperlink r:id="rId96">
         <w:r>
           <w:rPr>
             <w:rStyle w:val="Hyperlink"/>
@@ -10096,8 +10251,8 @@
         <w:t xml:space="preserve">, 7302 (2021).</w:t>
       </w:r>
     </w:p>
-    <w:bookmarkEnd w:id="93"/>
-    <w:bookmarkStart w:id="95" w:name="ref-xiang2019thalamic"/>
+    <w:bookmarkEnd w:id="97"/>
+    <w:bookmarkStart w:id="99" w:name="ref-xiang2019thalamic"/>
     <w:p>
       <w:pPr>
         <w:pStyle w:val="Bibliography"/>
@@ -10127,7 +10282,7 @@
       <w:r>
         <w:t xml:space="preserve"> </w:t>
       </w:r>
-      <w:hyperlink r:id="rId94">
+      <w:hyperlink r:id="rId98">
         <w:r>
           <w:rPr>
             <w:rStyle w:val="Hyperlink"/>
@@ -10168,8 +10323,8 @@
         <w:t xml:space="preserve">, 487–497.e7 (2019).</w:t>
       </w:r>
     </w:p>
-    <w:bookmarkEnd w:id="95"/>
-    <w:bookmarkStart w:id="97" w:name="ref-traag2019leiden"/>
+    <w:bookmarkEnd w:id="99"/>
+    <w:bookmarkStart w:id="101" w:name="ref-traag2019leiden"/>
     <w:p>
       <w:pPr>
         <w:pStyle w:val="Bibliography"/>
@@ -10189,7 +10344,7 @@
       <w:r>
         <w:t xml:space="preserve"> </w:t>
       </w:r>
-      <w:hyperlink r:id="rId96">
+      <w:hyperlink r:id="rId100">
         <w:r>
           <w:rPr>
             <w:rStyle w:val="Hyperlink"/>
@@ -10266,8 +10421,8 @@
         <w:t xml:space="preserve">, 5233 (2019).</w:t>
       </w:r>
     </w:p>
-    <w:bookmarkEnd w:id="97"/>
-    <w:bookmarkStart w:id="99" w:name="ref-mcinnes2018umap"/>
+    <w:bookmarkEnd w:id="101"/>
+    <w:bookmarkStart w:id="103" w:name="ref-mcinnes2018umap"/>
     <w:p>
       <w:pPr>
         <w:pStyle w:val="Bibliography"/>
@@ -10306,7 +10461,7 @@
       <w:r>
         <w:t xml:space="preserve"> </w:t>
       </w:r>
-      <w:hyperlink r:id="rId98">
+      <w:hyperlink r:id="rId102">
         <w:r>
           <w:rPr>
             <w:rStyle w:val="Hyperlink"/>
@@ -10320,7 +10475,7 @@
       <w:r>
         <w:t xml:space="preserve">(2018) doi:</w:t>
       </w:r>
-      <w:hyperlink r:id="rId98">
+      <w:hyperlink r:id="rId102">
         <w:r>
           <w:rPr>
             <w:rStyle w:val="Hyperlink"/>
@@ -10332,8 +10487,8 @@
         <w:t xml:space="preserve">.</w:t>
       </w:r>
     </w:p>
-    <w:bookmarkEnd w:id="99"/>
-    <w:bookmarkStart w:id="101" w:name="ref-velmeshev2023cortex"/>
+    <w:bookmarkEnd w:id="103"/>
+    <w:bookmarkStart w:id="105" w:name="ref-velmeshev2023cortex"/>
     <w:p>
       <w:pPr>
         <w:pStyle w:val="Bibliography"/>
@@ -10363,7 +10518,7 @@
       <w:r>
         <w:t xml:space="preserve"> </w:t>
       </w:r>
-      <w:hyperlink r:id="rId100">
+      <w:hyperlink r:id="rId104">
         <w:r>
           <w:rPr>
             <w:rStyle w:val="Hyperlink"/>
@@ -10398,8 +10553,8 @@
         <w:t xml:space="preserve">, eadf0834 (2023).</w:t>
       </w:r>
     </w:p>
-    <w:bookmarkEnd w:id="101"/>
-    <w:bookmarkStart w:id="103" w:name="ref-weinberger2023contrastivevi"/>
+    <w:bookmarkEnd w:id="105"/>
+    <w:bookmarkStart w:id="107" w:name="ref-weinberger2023contrastivevi"/>
     <w:p>
       <w:pPr>
         <w:pStyle w:val="Bibliography"/>
@@ -10419,7 +10574,7 @@
       <w:r>
         <w:t xml:space="preserve"> </w:t>
       </w:r>
-      <w:hyperlink r:id="rId102">
+      <w:hyperlink r:id="rId106">
         <w:r>
           <w:rPr>
             <w:rStyle w:val="Hyperlink"/>
@@ -10454,8 +10609,8 @@
         <w:t xml:space="preserve">, 1336–1345 (2023).</w:t>
       </w:r>
     </w:p>
-    <w:bookmarkEnd w:id="103"/>
-    <w:bookmarkStart w:id="105" w:name="ref-bonneel2015sliced"/>
+    <w:bookmarkEnd w:id="107"/>
+    <w:bookmarkStart w:id="109" w:name="ref-bonneel2015sliced"/>
     <w:p>
       <w:pPr>
         <w:pStyle w:val="Bibliography"/>
@@ -10475,7 +10630,7 @@
       <w:r>
         <w:t xml:space="preserve"> </w:t>
       </w:r>
-      <w:hyperlink r:id="rId104">
+      <w:hyperlink r:id="rId108">
         <w:r>
           <w:rPr>
             <w:rStyle w:val="Hyperlink"/>
@@ -10546,8 +10701,8 @@
         <w:t xml:space="preserve">, 22–45 (2015).</w:t>
       </w:r>
     </w:p>
-    <w:bookmarkEnd w:id="105"/>
-    <w:bookmarkStart w:id="107" w:name="ref-benjamini1995fdr"/>
+    <w:bookmarkEnd w:id="109"/>
+    <w:bookmarkStart w:id="111" w:name="ref-benjamini1995fdr"/>
     <w:p>
       <w:pPr>
         <w:pStyle w:val="Bibliography"/>
@@ -10567,7 +10722,7 @@
       <w:r>
         <w:t xml:space="preserve"> </w:t>
       </w:r>
-      <w:hyperlink r:id="rId106">
+      <w:hyperlink r:id="rId110">
         <w:r>
           <w:rPr>
             <w:rStyle w:val="Hyperlink"/>
@@ -10602,10 +10757,9 @@
         <w:t xml:space="preserve">, 289–300 (1995).</w:t>
       </w:r>
     </w:p>
-    <w:bookmarkEnd w:id="107"/>
-    <w:bookmarkEnd w:id="108"/>
-    <w:bookmarkEnd w:id="109"/>
-    <w:bookmarkEnd w:id="110"/>
+    <w:bookmarkEnd w:id="111"/>
+    <w:bookmarkEnd w:id="112"/>
+    <w:bookmarkEnd w:id="113"/>
     <w:sectPr>
       <w:footnotePr>
         <w:numRestart w:val="eachSect"/>

</xml_diff>